<commit_message>
Freeze v3 router and current demo backend
</commit_message>
<xml_diff>
--- a/demo queries.docx
+++ b/demo queries.docx
@@ -3,1923 +3,76 @@
 <w:document xmlns:wpc="http://schemas.microsoft.com/office/word/2010/wordprocessingCanvas" xmlns:cx="http://schemas.microsoft.com/office/drawing/2014/chartex" xmlns:cx1="http://schemas.microsoft.com/office/drawing/2015/9/8/chartex" xmlns:cx2="http://schemas.microsoft.com/office/drawing/2015/10/21/chartex" xmlns:cx3="http://schemas.microsoft.com/office/drawing/2016/5/9/chartex" xmlns:cx4="http://schemas.microsoft.com/office/drawing/2016/5/10/chartex" xmlns:cx5="http://schemas.microsoft.com/office/drawing/2016/5/11/chartex" xmlns:cx6="http://schemas.microsoft.com/office/drawing/2016/5/12/chartex" xmlns:cx7="http://schemas.microsoft.com/office/drawing/2016/5/13/chartex" xmlns:cx8="http://schemas.microsoft.com/office/drawing/2016/5/14/chartex" xmlns:mc="http://schemas.openxmlformats.org/markup-compatibility/2006" xmlns:aink="http://schemas.microsoft.com/office/drawing/2016/ink" xmlns:am3d="http://schemas.microsoft.com/office/drawing/2017/model3d" xmlns:o="urn:schemas-microsoft-com:office:office" xmlns:oel="http://schemas.microsoft.com/office/2019/extlst" xmlns:r="http://schemas.openxmlformats.org/officeDocument/2006/relationships" xmlns:m="http://schemas.openxmlformats.org/officeDocument/2006/math" xmlns:v="urn:schemas-microsoft-com:vml" xmlns:wp14="http://schemas.microsoft.com/office/word/2010/wordprocessingDrawing" xmlns:wp="http://schemas.openxmlformats.org/drawingml/2006/wordprocessingDrawing" xmlns:w10="urn:schemas-microsoft-com:office:word" xmlns:w="http://schemas.openxmlformats.org/wordprocessingml/2006/main" xmlns:w14="http://schemas.microsoft.com/office/word/2010/wordml" xmlns:w15="http://schemas.microsoft.com/office/word/2012/wordml" xmlns:w16cex="http://schemas.microsoft.com/office/word/2018/wordml/cex" xmlns:w16cid="http://schemas.microsoft.com/office/word/2016/wordml/cid" xmlns:w16="http://schemas.microsoft.com/office/word/2018/wordml" xmlns:w16du="http://schemas.microsoft.com/office/word/2023/wordml/word16du" xmlns:w16sdtdh="http://schemas.microsoft.com/office/word/2020/wordml/sdtdatahash" xmlns:w16sdtfl="http://schemas.microsoft.com/office/word/2024/wordml/sdtformatlock" xmlns:w16se="http://schemas.microsoft.com/office/word/2015/wordml/symex" xmlns:wpg="http://schemas.microsoft.com/office/word/2010/wordprocessingGroup" xmlns:wpi="http://schemas.microsoft.com/office/word/2010/wordprocessingInk" xmlns:wne="http://schemas.microsoft.com/office/word/2006/wordml" xmlns:wps="http://schemas.microsoft.com/office/word/2010/wordprocessingShape" mc:Ignorable="w14 w15 w16se w16cid w16 w16cex w16sdtdh w16sdtfl w16du wp14">
   <w:body>
     <w:p>
-      <w:pPr>
-        <w:rPr>
-          <w:b/>
-          <w:bCs/>
-        </w:rPr>
-      </w:pPr>
       <w:r>
-        <w:rPr>
-          <w:b/>
-          <w:bCs/>
-        </w:rPr>
-        <w:t>1. Forecast overview</w:t>
-      </w:r>
-    </w:p>
-    <w:p>
-      <w:r>
-        <w:t>Generate an operational summary for tomorrow</w:t>
-      </w:r>
-    </w:p>
-    <w:p>
-      <w:r>
-        <w:t>Demonstrates:</w:t>
-      </w:r>
-    </w:p>
-    <w:p>
-      <w:pPr>
-        <w:numPr>
-          <w:ilvl w:val="0"/>
-          <w:numId w:val="1"/>
-        </w:numPr>
-      </w:pPr>
-      <w:r>
-        <w:rPr>
-          <w:b/>
-          <w:bCs/>
-        </w:rPr>
-        <w:t>Mistral Coordinator Agent:</w:t>
-      </w:r>
-      <w:r>
-        <w:t xml:space="preserve"> recognizes a day-ahead summary request. </w:t>
-      </w:r>
-    </w:p>
-    <w:p>
-      <w:pPr>
-        <w:numPr>
-          <w:ilvl w:val="0"/>
-          <w:numId w:val="1"/>
-        </w:numPr>
-      </w:pPr>
-      <w:r>
-        <w:rPr>
-          <w:b/>
-          <w:bCs/>
-        </w:rPr>
-        <w:t>Forecast Agent:</w:t>
-      </w:r>
-      <w:r>
-        <w:t xml:space="preserve"> supplies 288 five-minute traffic intervals. </w:t>
-      </w:r>
-    </w:p>
-    <w:p>
-      <w:pPr>
-        <w:numPr>
-          <w:ilvl w:val="0"/>
-          <w:numId w:val="1"/>
-        </w:numPr>
-      </w:pPr>
-      <w:r>
-        <w:rPr>
-          <w:b/>
-          <w:bCs/>
-        </w:rPr>
-        <w:t>SLA Agent:</w:t>
-      </w:r>
-      <w:r>
-        <w:t xml:space="preserve"> provides state classifications and risk scores. </w:t>
-      </w:r>
-    </w:p>
-    <w:p>
-      <w:pPr>
-        <w:numPr>
-          <w:ilvl w:val="0"/>
-          <w:numId w:val="1"/>
-        </w:numPr>
-      </w:pPr>
-      <w:r>
-        <w:rPr>
-          <w:b/>
-          <w:bCs/>
-        </w:rPr>
-        <w:t>Guardrail Agent:</w:t>
-      </w:r>
-      <w:r>
-        <w:t xml:space="preserve"> attaches the low-confidence warning. </w:t>
-      </w:r>
-    </w:p>
-    <w:p>
-      <w:pPr>
-        <w:numPr>
-          <w:ilvl w:val="0"/>
-          <w:numId w:val="1"/>
-        </w:numPr>
-      </w:pPr>
-      <w:r>
-        <w:rPr>
-          <w:b/>
-          <w:bCs/>
-        </w:rPr>
-        <w:t>Operator Response Agent:</w:t>
-      </w:r>
-      <w:r>
-        <w:t xml:space="preserve"> produces the concise summary. </w:t>
-      </w:r>
-    </w:p>
-    <w:p>
-      <w:r>
-        <w:t>Purpose:</w:t>
-      </w:r>
-    </w:p>
-    <w:p>
-      <w:r>
-        <w:t>Establishes the complete day-ahead operational situation.</w:t>
-      </w:r>
-    </w:p>
-    <w:p>
-      <w:r>
-        <w:pict w14:anchorId="1DC312A3">
-          <v:rect id="_x0000_i1025" style="width:0;height:1.5pt" o:hralign="center" o:hrstd="t" o:hr="t" fillcolor="#a0a0a0" stroked="f"/>
-        </w:pict>
-      </w:r>
-    </w:p>
-    <w:p>
-      <w:pPr>
-        <w:rPr>
-          <w:b/>
-          <w:bCs/>
-        </w:rPr>
-      </w:pPr>
-      <w:r>
-        <w:rPr>
-          <w:b/>
-          <w:bCs/>
-        </w:rPr>
-        <w:t>2. SLA-risk detection</w:t>
-      </w:r>
-    </w:p>
-    <w:p>
-      <w:r>
-        <w:t>Tell me the next predicted SLA-risk interval</w:t>
-      </w:r>
-    </w:p>
-    <w:p>
-      <w:r>
-        <w:t>Demonstrates:</w:t>
-      </w:r>
-    </w:p>
-    <w:p>
-      <w:pPr>
-        <w:numPr>
-          <w:ilvl w:val="0"/>
-          <w:numId w:val="2"/>
-        </w:numPr>
-      </w:pPr>
-      <w:r>
-        <w:rPr>
-          <w:b/>
-          <w:bCs/>
-        </w:rPr>
-        <w:t>Mistral Coordinator Agent:</w:t>
-      </w:r>
-      <w:r>
-        <w:t xml:space="preserve"> selects the </w:t>
-      </w:r>
-      <w:proofErr w:type="spellStart"/>
-      <w:r>
-        <w:t>next_risk</w:t>
-      </w:r>
-      <w:proofErr w:type="spellEnd"/>
-      <w:r>
-        <w:t xml:space="preserve"> workflow. </w:t>
-      </w:r>
-    </w:p>
-    <w:p>
-      <w:pPr>
-        <w:numPr>
-          <w:ilvl w:val="0"/>
-          <w:numId w:val="2"/>
-        </w:numPr>
-      </w:pPr>
-      <w:r>
-        <w:rPr>
-          <w:b/>
-          <w:bCs/>
-        </w:rPr>
-        <w:t>SLA Agent:</w:t>
-      </w:r>
-      <w:r>
-        <w:t xml:space="preserve"> identifies the earliest non-normal classification. </w:t>
-      </w:r>
-    </w:p>
-    <w:p>
-      <w:pPr>
-        <w:numPr>
-          <w:ilvl w:val="0"/>
-          <w:numId w:val="2"/>
-        </w:numPr>
-      </w:pPr>
-      <w:r>
-        <w:rPr>
-          <w:b/>
-          <w:bCs/>
-        </w:rPr>
-        <w:t>Guardrail Agent:</w:t>
-      </w:r>
-      <w:r>
-        <w:t xml:space="preserve"> detects low classifier confidence. </w:t>
-      </w:r>
-    </w:p>
-    <w:p>
-      <w:pPr>
-        <w:numPr>
-          <w:ilvl w:val="0"/>
-          <w:numId w:val="2"/>
-        </w:numPr>
-      </w:pPr>
-      <w:r>
-        <w:rPr>
-          <w:b/>
-          <w:bCs/>
-        </w:rPr>
-        <w:t>Operator Response Agent:</w:t>
-      </w:r>
-      <w:r>
-        <w:t xml:space="preserve"> explains the interval and warning. </w:t>
-      </w:r>
-    </w:p>
-    <w:p>
-      <w:r>
-        <w:t>Purpose:</w:t>
-      </w:r>
-    </w:p>
-    <w:p>
-      <w:r>
-        <w:t>Shows proactive identification of the first potential service problem.</w:t>
-      </w:r>
-    </w:p>
-    <w:p>
-      <w:r>
-        <w:pict w14:anchorId="5FAEA84B">
-          <v:rect id="_x0000_i1026" style="width:0;height:1.5pt" o:hralign="center" o:hrstd="t" o:hr="t" fillcolor="#a0a0a0" stroked="f"/>
-        </w:pict>
-      </w:r>
-    </w:p>
-    <w:p>
-      <w:pPr>
-        <w:rPr>
-          <w:b/>
-          <w:bCs/>
-        </w:rPr>
-      </w:pPr>
-      <w:r>
-        <w:rPr>
-          <w:b/>
-          <w:bCs/>
-        </w:rPr>
-        <w:t>3. Diagnosis</w:t>
-      </w:r>
-    </w:p>
-    <w:p>
-      <w:r>
-        <w:t>Which service contributes most during the highest-risk interval?</w:t>
-      </w:r>
-    </w:p>
-    <w:p>
-      <w:r>
-        <w:t>Demonstrates:</w:t>
-      </w:r>
-    </w:p>
-    <w:p>
-      <w:pPr>
-        <w:numPr>
-          <w:ilvl w:val="0"/>
-          <w:numId w:val="3"/>
-        </w:numPr>
-      </w:pPr>
-      <w:r>
-        <w:rPr>
-          <w:b/>
-          <w:bCs/>
-        </w:rPr>
-        <w:t>Mistral Coordinator Agent:</w:t>
-      </w:r>
-      <w:r>
-        <w:t xml:space="preserve"> distinguishes diagnosis from basic forecasting. </w:t>
-      </w:r>
-    </w:p>
-    <w:p>
-      <w:pPr>
-        <w:numPr>
-          <w:ilvl w:val="0"/>
-          <w:numId w:val="3"/>
-        </w:numPr>
-      </w:pPr>
-      <w:r>
-        <w:rPr>
-          <w:b/>
-          <w:bCs/>
-        </w:rPr>
-        <w:t>SLA Agent:</w:t>
-      </w:r>
-      <w:r>
-        <w:t xml:space="preserve"> locates the highest-risk interval. </w:t>
-      </w:r>
-    </w:p>
-    <w:p>
-      <w:pPr>
-        <w:numPr>
-          <w:ilvl w:val="0"/>
-          <w:numId w:val="3"/>
-        </w:numPr>
-      </w:pPr>
-      <w:r>
-        <w:rPr>
-          <w:b/>
-          <w:bCs/>
-        </w:rPr>
-        <w:t>Diagnosis Agent:</w:t>
-      </w:r>
-      <w:r>
-        <w:t xml:space="preserve"> compares Enterprise, RAN and PON contributions. </w:t>
-      </w:r>
-    </w:p>
-    <w:p>
-      <w:pPr>
-        <w:numPr>
-          <w:ilvl w:val="0"/>
-          <w:numId w:val="3"/>
-        </w:numPr>
-      </w:pPr>
-      <w:r>
-        <w:rPr>
-          <w:b/>
-          <w:bCs/>
-        </w:rPr>
-        <w:t>Operator Response Agent:</w:t>
-      </w:r>
-      <w:r>
-        <w:t xml:space="preserve"> identifies RAN as the dominant service. </w:t>
-      </w:r>
-    </w:p>
-    <w:p>
-      <w:r>
-        <w:t>Purpose:</w:t>
-      </w:r>
-    </w:p>
-    <w:p>
-      <w:r>
-        <w:t>Moves from detecting risk to explaining the likely contributing service.</w:t>
-      </w:r>
-    </w:p>
-    <w:p>
-      <w:r>
-        <w:pict w14:anchorId="4A7B1E1C">
-          <v:rect id="_x0000_i1027" style="width:0;height:1.5pt" o:hralign="center" o:hrstd="t" o:hr="t" fillcolor="#a0a0a0" stroked="f"/>
-        </w:pict>
-      </w:r>
-    </w:p>
-    <w:p>
-      <w:pPr>
-        <w:rPr>
-          <w:b/>
-          <w:bCs/>
-        </w:rPr>
-      </w:pPr>
-      <w:r>
-        <w:rPr>
-          <w:b/>
-          <w:bCs/>
-        </w:rPr>
-        <w:t>4. Recovery and allocation</w:t>
-      </w:r>
-    </w:p>
-    <w:p>
-      <w:r>
-        <w:t>What subcarrier allocation is recommended at the highest-risk interval?</w:t>
-      </w:r>
-    </w:p>
-    <w:p>
-      <w:r>
-        <w:t>Demonstrates:</w:t>
-      </w:r>
-    </w:p>
-    <w:p>
-      <w:pPr>
-        <w:numPr>
-          <w:ilvl w:val="0"/>
-          <w:numId w:val="4"/>
-        </w:numPr>
-      </w:pPr>
-      <w:r>
-        <w:rPr>
-          <w:b/>
-          <w:bCs/>
-        </w:rPr>
-        <w:t>Mistral Coordinator Agent:</w:t>
-      </w:r>
-      <w:r>
-        <w:t xml:space="preserve"> selects the recovery workflow. </w:t>
-      </w:r>
-    </w:p>
-    <w:p>
-      <w:pPr>
-        <w:numPr>
-          <w:ilvl w:val="0"/>
-          <w:numId w:val="4"/>
-        </w:numPr>
-      </w:pPr>
-      <w:r>
-        <w:rPr>
-          <w:b/>
-          <w:bCs/>
-        </w:rPr>
-        <w:t>Recovery Agent:</w:t>
-      </w:r>
-      <w:r>
-        <w:t xml:space="preserve"> evaluates the three observed allocations. </w:t>
-      </w:r>
-    </w:p>
-    <w:p>
-      <w:pPr>
-        <w:numPr>
-          <w:ilvl w:val="0"/>
-          <w:numId w:val="4"/>
-        </w:numPr>
-      </w:pPr>
-      <w:r>
-        <w:rPr>
-          <w:b/>
-          <w:bCs/>
-        </w:rPr>
-        <w:t>Recovery Agent:</w:t>
-      </w:r>
-      <w:r>
-        <w:t xml:space="preserve"> calculates per-service capacities and residual overflow. </w:t>
-      </w:r>
-    </w:p>
-    <w:p>
-      <w:pPr>
-        <w:numPr>
-          <w:ilvl w:val="0"/>
-          <w:numId w:val="4"/>
-        </w:numPr>
-      </w:pPr>
-      <w:r>
-        <w:rPr>
-          <w:b/>
-          <w:bCs/>
-        </w:rPr>
-        <w:t>Guardrail Agent:</w:t>
-      </w:r>
-      <w:r>
-        <w:t xml:space="preserve"> ensures the recommendation remains advisory. </w:t>
-      </w:r>
-    </w:p>
-    <w:p>
-      <w:pPr>
-        <w:numPr>
-          <w:ilvl w:val="0"/>
-          <w:numId w:val="4"/>
-        </w:numPr>
-      </w:pPr>
-      <w:r>
-        <w:rPr>
-          <w:b/>
-          <w:bCs/>
-        </w:rPr>
-        <w:t>Operator Response Agent:</w:t>
-      </w:r>
-      <w:r>
-        <w:t xml:space="preserve"> translates allocation codes into readable language. </w:t>
-      </w:r>
-    </w:p>
-    <w:p>
-      <w:r>
-        <w:t>Purpose:</w:t>
-      </w:r>
-    </w:p>
-    <w:p>
-      <w:r>
-        <w:t>Shows actionable decision support while retaining human approval.</w:t>
-      </w:r>
-    </w:p>
-    <w:p>
-      <w:r>
-        <w:pict w14:anchorId="703F0258">
-          <v:rect id="_x0000_i1028" style="width:0;height:1.5pt" o:hralign="center" o:hrstd="t" o:hr="t" fillcolor="#a0a0a0" stroked="f"/>
-        </w:pict>
-      </w:r>
-    </w:p>
-    <w:p>
-      <w:pPr>
-        <w:rPr>
-          <w:b/>
-          <w:bCs/>
-        </w:rPr>
-      </w:pPr>
-      <w:r>
-        <w:rPr>
-          <w:b/>
-          <w:bCs/>
-        </w:rPr>
-        <w:t>5. Service traffic analysis</w:t>
-      </w:r>
-    </w:p>
-    <w:p>
-      <w:r>
-        <w:t>When is RAN traffic expected to peak?</w:t>
-      </w:r>
-    </w:p>
-    <w:p>
-      <w:r>
-        <w:t>Demonstrates:</w:t>
-      </w:r>
-    </w:p>
-    <w:p>
-      <w:pPr>
-        <w:numPr>
-          <w:ilvl w:val="0"/>
-          <w:numId w:val="5"/>
-        </w:numPr>
-      </w:pPr>
-      <w:r>
-        <w:rPr>
-          <w:b/>
-          <w:bCs/>
-        </w:rPr>
-        <w:t>Mistral Coordinator Agent:</w:t>
-      </w:r>
-      <w:r>
-        <w:t xml:space="preserve"> extracts service=ran. </w:t>
-      </w:r>
-    </w:p>
-    <w:p>
-      <w:pPr>
-        <w:numPr>
-          <w:ilvl w:val="0"/>
-          <w:numId w:val="5"/>
-        </w:numPr>
-      </w:pPr>
-      <w:r>
-        <w:rPr>
-          <w:b/>
-          <w:bCs/>
-        </w:rPr>
-        <w:lastRenderedPageBreak/>
-        <w:t>Mistral Coordinator Agent:</w:t>
-      </w:r>
-      <w:r>
-        <w:t xml:space="preserve"> selects </w:t>
-      </w:r>
-      <w:proofErr w:type="spellStart"/>
-      <w:r>
-        <w:t>service_peak</w:t>
-      </w:r>
-      <w:proofErr w:type="spellEnd"/>
-      <w:r>
-        <w:t xml:space="preserve"> and </w:t>
-      </w:r>
-      <w:proofErr w:type="spellStart"/>
-      <w:r>
-        <w:t>top_k</w:t>
-      </w:r>
-      <w:proofErr w:type="spellEnd"/>
-      <w:r>
-        <w:t xml:space="preserve">=1. </w:t>
-      </w:r>
-    </w:p>
-    <w:p>
-      <w:pPr>
-        <w:numPr>
-          <w:ilvl w:val="0"/>
-          <w:numId w:val="5"/>
-        </w:numPr>
-      </w:pPr>
-      <w:r>
-        <w:rPr>
-          <w:b/>
-          <w:bCs/>
-        </w:rPr>
-        <w:t>Forecast Agent:</w:t>
-      </w:r>
-      <w:r>
-        <w:t xml:space="preserve"> searches all 288 RAN forecast intervals. </w:t>
-      </w:r>
-    </w:p>
-    <w:p>
-      <w:pPr>
-        <w:numPr>
-          <w:ilvl w:val="0"/>
-          <w:numId w:val="5"/>
-        </w:numPr>
-      </w:pPr>
-      <w:r>
-        <w:rPr>
-          <w:b/>
-          <w:bCs/>
-        </w:rPr>
-        <w:t>Operator Response Agent:</w:t>
-      </w:r>
-      <w:r>
-        <w:t xml:space="preserve"> returns the peak time and load. </w:t>
-      </w:r>
-    </w:p>
-    <w:p>
-      <w:r>
-        <w:t>Purpose:</w:t>
-      </w:r>
-    </w:p>
-    <w:p>
-      <w:r>
-        <w:t>Demonstrates service-specific analytical tool selection.</w:t>
-      </w:r>
-    </w:p>
-    <w:p>
-      <w:r>
-        <w:pict w14:anchorId="3C49D292">
-          <v:rect id="_x0000_i1029" style="width:0;height:1.5pt" o:hralign="center" o:hrstd="t" o:hr="t" fillcolor="#a0a0a0" stroked="f"/>
-        </w:pict>
-      </w:r>
-    </w:p>
-    <w:p>
-      <w:pPr>
-        <w:rPr>
-          <w:b/>
-          <w:bCs/>
-        </w:rPr>
-      </w:pPr>
-      <w:r>
-        <w:rPr>
-          <w:b/>
-          <w:bCs/>
-        </w:rPr>
-        <w:t>6. Contextual follow-up</w:t>
-      </w:r>
-    </w:p>
-    <w:p>
-      <w:r>
-        <w:t>Ask this immediately after the RAN peak question:</w:t>
-      </w:r>
-    </w:p>
-    <w:p>
-      <w:r>
-        <w:t>Do the same for PON</w:t>
-      </w:r>
-    </w:p>
-    <w:p>
-      <w:r>
-        <w:t>Demonstrates:</w:t>
-      </w:r>
-    </w:p>
-    <w:p>
-      <w:pPr>
-        <w:numPr>
-          <w:ilvl w:val="0"/>
-          <w:numId w:val="6"/>
-        </w:numPr>
-      </w:pPr>
-      <w:r>
-        <w:rPr>
-          <w:b/>
-          <w:bCs/>
-        </w:rPr>
-        <w:t>Mistral Coordinator Agent:</w:t>
-      </w:r>
-      <w:r>
-        <w:t xml:space="preserve"> interprets a contextual follow-up. </w:t>
-      </w:r>
-    </w:p>
-    <w:p>
-      <w:pPr>
-        <w:numPr>
-          <w:ilvl w:val="0"/>
-          <w:numId w:val="6"/>
-        </w:numPr>
-      </w:pPr>
-      <w:r>
-        <w:rPr>
-          <w:b/>
-          <w:bCs/>
-        </w:rPr>
-        <w:t>Shared conversational state:</w:t>
-      </w:r>
-      <w:r>
-        <w:t xml:space="preserve"> reuses the previous </w:t>
-      </w:r>
-      <w:proofErr w:type="spellStart"/>
-      <w:r>
-        <w:t>service_peak</w:t>
-      </w:r>
-      <w:proofErr w:type="spellEnd"/>
-      <w:r>
-        <w:t xml:space="preserve"> intent. </w:t>
-      </w:r>
-    </w:p>
-    <w:p>
-      <w:pPr>
-        <w:numPr>
-          <w:ilvl w:val="0"/>
-          <w:numId w:val="6"/>
-        </w:numPr>
-      </w:pPr>
-      <w:r>
-        <w:rPr>
-          <w:b/>
-          <w:bCs/>
-        </w:rPr>
-        <w:t>Coordinator:</w:t>
-      </w:r>
-      <w:r>
-        <w:t xml:space="preserve"> changes the target service from RAN to PON. </w:t>
-      </w:r>
-    </w:p>
-    <w:p>
-      <w:pPr>
-        <w:numPr>
-          <w:ilvl w:val="0"/>
-          <w:numId w:val="6"/>
-        </w:numPr>
-      </w:pPr>
-      <w:r>
-        <w:rPr>
-          <w:b/>
-          <w:bCs/>
-        </w:rPr>
-        <w:t>Forecast Agent:</w:t>
-      </w:r>
-      <w:r>
-        <w:t xml:space="preserve"> calculates the corresponding PON peak. </w:t>
-      </w:r>
-    </w:p>
-    <w:p>
-      <w:pPr>
-        <w:numPr>
-          <w:ilvl w:val="0"/>
-          <w:numId w:val="6"/>
-        </w:numPr>
-      </w:pPr>
-      <w:r>
-        <w:rPr>
-          <w:b/>
-          <w:bCs/>
-        </w:rPr>
-        <w:t>Operator Response Agent:</w:t>
-      </w:r>
-      <w:r>
-        <w:t xml:space="preserve"> returns the PON result. </w:t>
-      </w:r>
-    </w:p>
-    <w:p>
-      <w:r>
-        <w:t>Purpose:</w:t>
-      </w:r>
-    </w:p>
-    <w:p>
-      <w:r>
-        <w:t>Demonstrates that the assistant maintains context instead of treating every question as an isolated command.</w:t>
-      </w:r>
-    </w:p>
-    <w:p>
-      <w:pPr>
-        <w:shd w:val="clear" w:color="auto" w:fill="0E1117"/>
-        <w:rPr>
-          <w:rFonts w:ascii="Arial" w:hAnsi="Arial" w:cs="Arial"/>
-          <w:color w:val="FFFFFF"/>
-        </w:rPr>
-      </w:pPr>
-      <w:r>
-        <w:rPr>
-          <w:rFonts w:ascii="Segoe UI Emoji" w:hAnsi="Segoe UI Emoji" w:cs="Segoe UI Emoji"/>
-          <w:color w:val="FFFFFF"/>
-        </w:rPr>
-        <w:t>🧑</w:t>
-      </w:r>
-      <w:r>
-        <w:rPr>
-          <w:rFonts w:ascii="Arial" w:hAnsi="Arial" w:cs="Arial"/>
-          <w:color w:val="FFFFFF"/>
-        </w:rPr>
-        <w:t>‍</w:t>
-      </w:r>
-      <w:r>
-        <w:rPr>
-          <w:rFonts w:ascii="Segoe UI Emoji" w:hAnsi="Segoe UI Emoji" w:cs="Segoe UI Emoji"/>
-          <w:color w:val="FFFFFF"/>
-        </w:rPr>
-        <w:t>💻</w:t>
-      </w:r>
-    </w:p>
-    <w:p>
-      <w:pPr>
-        <w:pStyle w:val="NormalWeb"/>
-        <w:shd w:val="clear" w:color="auto" w:fill="0E1117"/>
-        <w:rPr>
-          <w:rFonts w:ascii="Arial" w:hAnsi="Arial" w:cs="Arial"/>
-          <w:color w:val="FAFAFA"/>
-        </w:rPr>
-      </w:pPr>
-      <w:r>
-        <w:rPr>
-          <w:rFonts w:ascii="Arial" w:hAnsi="Arial" w:cs="Arial"/>
-          <w:color w:val="FAFAFA"/>
-        </w:rPr>
-        <w:t>Generate an operational summary for tomorrow</w:t>
-      </w:r>
-    </w:p>
-    <w:p>
-      <w:pPr>
-        <w:shd w:val="clear" w:color="auto" w:fill="0E1117"/>
-        <w:rPr>
-          <w:rFonts w:ascii="Arial" w:hAnsi="Arial" w:cs="Arial"/>
-          <w:color w:val="FFFFFF"/>
-        </w:rPr>
-      </w:pPr>
-      <w:r>
-        <w:rPr>
-          <w:rFonts w:ascii="Segoe UI Emoji" w:hAnsi="Segoe UI Emoji" w:cs="Segoe UI Emoji"/>
-          <w:color w:val="FFFFFF"/>
-        </w:rPr>
-        <w:t>🤖</w:t>
-      </w:r>
-    </w:p>
-    <w:p>
-      <w:pPr>
-        <w:pStyle w:val="NormalWeb"/>
-        <w:shd w:val="clear" w:color="auto" w:fill="0E1117"/>
-        <w:rPr>
-          <w:rFonts w:ascii="Arial" w:hAnsi="Arial" w:cs="Arial"/>
-          <w:color w:val="FAFAFA"/>
-        </w:rPr>
-      </w:pPr>
-      <w:r>
-        <w:rPr>
-          <w:rFonts w:ascii="Arial" w:hAnsi="Arial" w:cs="Arial"/>
-          <w:color w:val="FAFAFA"/>
-        </w:rPr>
-        <w:t>Tomorrow's network operation forecast:</w:t>
-      </w:r>
-    </w:p>
-    <w:p>
-      <w:pPr>
-        <w:numPr>
-          <w:ilvl w:val="0"/>
-          <w:numId w:val="7"/>
-        </w:numPr>
-        <w:shd w:val="clear" w:color="auto" w:fill="0E1117"/>
-        <w:spacing w:before="48" w:after="48"/>
-        <w:ind w:left="996"/>
-        <w:rPr>
-          <w:rFonts w:ascii="Arial" w:hAnsi="Arial" w:cs="Arial"/>
-          <w:color w:val="FAFAFA"/>
-        </w:rPr>
-      </w:pPr>
-      <w:r>
-        <w:rPr>
-          <w:rFonts w:ascii="Arial" w:hAnsi="Arial" w:cs="Arial"/>
-          <w:color w:val="FAFAFA"/>
-        </w:rPr>
-        <w:t>Normal state: 74.7% (215 intervals)</w:t>
-      </w:r>
-    </w:p>
-    <w:p>
-      <w:pPr>
-        <w:numPr>
-          <w:ilvl w:val="0"/>
-          <w:numId w:val="7"/>
-        </w:numPr>
-        <w:shd w:val="clear" w:color="auto" w:fill="0E1117"/>
-        <w:spacing w:before="48" w:after="48"/>
-        <w:ind w:left="996"/>
-        <w:rPr>
-          <w:rFonts w:ascii="Arial" w:hAnsi="Arial" w:cs="Arial"/>
-          <w:color w:val="FAFAFA"/>
-        </w:rPr>
-      </w:pPr>
-      <w:r>
-        <w:rPr>
-          <w:rFonts w:ascii="Arial" w:hAnsi="Arial" w:cs="Arial"/>
-          <w:color w:val="FAFAFA"/>
-        </w:rPr>
-        <w:t>Degraded state: 13.2% (38 intervals)</w:t>
-      </w:r>
-    </w:p>
-    <w:p>
-      <w:pPr>
-        <w:numPr>
-          <w:ilvl w:val="0"/>
-          <w:numId w:val="7"/>
-        </w:numPr>
-        <w:shd w:val="clear" w:color="auto" w:fill="0E1117"/>
-        <w:spacing w:before="48" w:after="48"/>
-        <w:ind w:left="996"/>
-        <w:rPr>
-          <w:rFonts w:ascii="Arial" w:hAnsi="Arial" w:cs="Arial"/>
-          <w:color w:val="FAFAFA"/>
-        </w:rPr>
-      </w:pPr>
-      <w:r>
-        <w:rPr>
-          <w:rFonts w:ascii="Arial" w:hAnsi="Arial" w:cs="Arial"/>
-          <w:color w:val="FAFAFA"/>
-        </w:rPr>
-        <w:t>Failure-prone state: 12.2% (35 intervals)</w:t>
-      </w:r>
-    </w:p>
-    <w:p>
-      <w:pPr>
-        <w:pStyle w:val="NormalWeb"/>
-        <w:shd w:val="clear" w:color="auto" w:fill="0E1117"/>
-        <w:rPr>
-          <w:rFonts w:ascii="Arial" w:hAnsi="Arial" w:cs="Arial"/>
-          <w:color w:val="FAFAFA"/>
-        </w:rPr>
-      </w:pPr>
-      <w:r>
-        <w:rPr>
-          <w:rFonts w:ascii="Arial" w:hAnsi="Arial" w:cs="Arial"/>
-          <w:color w:val="FAFAFA"/>
-        </w:rPr>
-        <w:t>Peak risk is expected at 21:15, with a failure-prone state, 4.66 Gbps enterprise, 45.17 Gbps ran, 38.66 Gbps PON, total 88.5 Gbps, failure-prone score 0.88, and classifier confidence 0.88.</w:t>
-      </w:r>
-    </w:p>
-    <w:p>
-      <w:pPr>
-        <w:pStyle w:val="NormalWeb"/>
-        <w:shd w:val="clear" w:color="auto" w:fill="0E1117"/>
-        <w:rPr>
-          <w:rFonts w:ascii="Arial" w:hAnsi="Arial" w:cs="Arial"/>
-          <w:color w:val="FAFAFA"/>
-        </w:rPr>
-      </w:pPr>
-      <w:r>
-        <w:rPr>
-          <w:rFonts w:ascii="Arial" w:hAnsi="Arial" w:cs="Arial"/>
-          <w:color w:val="FAFAFA"/>
-        </w:rPr>
-        <w:t>46 intervals have classifier confidence below 0.60.</w:t>
-      </w:r>
-    </w:p>
-    <w:p>
-      <w:pPr>
-        <w:shd w:val="clear" w:color="auto" w:fill="0E1117"/>
-        <w:rPr>
-          <w:rFonts w:ascii="Arial" w:hAnsi="Arial" w:cs="Arial"/>
-          <w:color w:val="FFFFFF"/>
-        </w:rPr>
-      </w:pPr>
-      <w:r>
-        <w:rPr>
-          <w:rFonts w:ascii="Segoe UI Emoji" w:hAnsi="Segoe UI Emoji" w:cs="Segoe UI Emoji"/>
-          <w:color w:val="FFFFFF"/>
-        </w:rPr>
-        <w:t>🧑</w:t>
-      </w:r>
-      <w:r>
-        <w:rPr>
-          <w:rFonts w:ascii="Arial" w:hAnsi="Arial" w:cs="Arial"/>
-          <w:color w:val="FFFFFF"/>
-        </w:rPr>
-        <w:t>‍</w:t>
-      </w:r>
-      <w:r>
-        <w:rPr>
-          <w:rFonts w:ascii="Segoe UI Emoji" w:hAnsi="Segoe UI Emoji" w:cs="Segoe UI Emoji"/>
-          <w:color w:val="FFFFFF"/>
-        </w:rPr>
-        <w:t>💻</w:t>
-      </w:r>
-    </w:p>
-    <w:p>
-      <w:pPr>
-        <w:pStyle w:val="NormalWeb"/>
-        <w:shd w:val="clear" w:color="auto" w:fill="0E1117"/>
-        <w:rPr>
-          <w:rFonts w:ascii="Arial" w:hAnsi="Arial" w:cs="Arial"/>
-          <w:color w:val="FAFAFA"/>
-        </w:rPr>
-      </w:pPr>
-      <w:r>
-        <w:rPr>
-          <w:rFonts w:ascii="Arial" w:hAnsi="Arial" w:cs="Arial"/>
-          <w:color w:val="FAFAFA"/>
-        </w:rPr>
-        <w:t>Tell me the next predicted SLA-risk interval</w:t>
-      </w:r>
-    </w:p>
-    <w:p>
-      <w:pPr>
-        <w:shd w:val="clear" w:color="auto" w:fill="0E1117"/>
-        <w:rPr>
-          <w:rFonts w:ascii="Arial" w:hAnsi="Arial" w:cs="Arial"/>
-          <w:color w:val="FFFFFF"/>
-        </w:rPr>
-      </w:pPr>
-      <w:r>
-        <w:rPr>
-          <w:rFonts w:ascii="Segoe UI Emoji" w:hAnsi="Segoe UI Emoji" w:cs="Segoe UI Emoji"/>
-          <w:color w:val="FFFFFF"/>
-        </w:rPr>
-        <w:t>🤖</w:t>
-      </w:r>
-    </w:p>
-    <w:p>
-      <w:pPr>
-        <w:pStyle w:val="NormalWeb"/>
-        <w:shd w:val="clear" w:color="auto" w:fill="0E1117"/>
-        <w:rPr>
-          <w:rFonts w:ascii="Arial" w:hAnsi="Arial" w:cs="Arial"/>
-          <w:color w:val="FAFAFA"/>
-        </w:rPr>
-      </w:pPr>
-      <w:r>
-        <w:rPr>
-          <w:rFonts w:ascii="Arial" w:hAnsi="Arial" w:cs="Arial"/>
-          <w:color w:val="FAFAFA"/>
-        </w:rPr>
-        <w:t xml:space="preserve">The next predicted SLA-risk interval is at 17:00, with a degraded state, 23.51 Gbps enterprise, 35.14 Gbps ran, 24.27 Gbps PON, total 82.93 Gbps, failure-prone score </w:t>
-      </w:r>
-      <w:r>
-        <w:rPr>
-          <w:rFonts w:ascii="Arial" w:hAnsi="Arial" w:cs="Arial"/>
-          <w:color w:val="FAFAFA"/>
-        </w:rPr>
-        <w:lastRenderedPageBreak/>
-        <w:t>0.16, and classifier confidence 0.43. Please note that the classifier confidence is low (0.43).</w:t>
-      </w:r>
-    </w:p>
-    <w:p>
-      <w:pPr>
-        <w:shd w:val="clear" w:color="auto" w:fill="0E1117"/>
-        <w:rPr>
-          <w:rFonts w:ascii="Arial" w:hAnsi="Arial" w:cs="Arial"/>
-          <w:color w:val="FFFFFF"/>
-        </w:rPr>
-      </w:pPr>
-      <w:r>
-        <w:rPr>
-          <w:rFonts w:ascii="Segoe UI Emoji" w:hAnsi="Segoe UI Emoji" w:cs="Segoe UI Emoji"/>
-          <w:color w:val="FFFFFF"/>
-        </w:rPr>
-        <w:t>🧑</w:t>
-      </w:r>
-      <w:r>
-        <w:rPr>
-          <w:rFonts w:ascii="Arial" w:hAnsi="Arial" w:cs="Arial"/>
-          <w:color w:val="FFFFFF"/>
-        </w:rPr>
-        <w:t>‍</w:t>
-      </w:r>
-      <w:r>
-        <w:rPr>
-          <w:rFonts w:ascii="Segoe UI Emoji" w:hAnsi="Segoe UI Emoji" w:cs="Segoe UI Emoji"/>
-          <w:color w:val="FFFFFF"/>
-        </w:rPr>
-        <w:t>💻</w:t>
-      </w:r>
-    </w:p>
-    <w:p>
-      <w:pPr>
-        <w:pStyle w:val="NormalWeb"/>
-        <w:shd w:val="clear" w:color="auto" w:fill="0E1117"/>
-        <w:rPr>
-          <w:rFonts w:ascii="Arial" w:hAnsi="Arial" w:cs="Arial"/>
-          <w:color w:val="FAFAFA"/>
-        </w:rPr>
-      </w:pPr>
-      <w:r>
-        <w:rPr>
-          <w:rFonts w:ascii="Arial" w:hAnsi="Arial" w:cs="Arial"/>
-          <w:color w:val="FAFAFA"/>
-        </w:rPr>
-        <w:t>Which service contributes most during the highest-risk interval?</w:t>
-      </w:r>
-    </w:p>
-    <w:p>
-      <w:pPr>
-        <w:shd w:val="clear" w:color="auto" w:fill="0E1117"/>
-        <w:rPr>
-          <w:rFonts w:ascii="Arial" w:hAnsi="Arial" w:cs="Arial"/>
-          <w:color w:val="FFFFFF"/>
-        </w:rPr>
-      </w:pPr>
-      <w:r>
-        <w:rPr>
-          <w:rFonts w:ascii="Segoe UI Emoji" w:hAnsi="Segoe UI Emoji" w:cs="Segoe UI Emoji"/>
-          <w:color w:val="FFFFFF"/>
-        </w:rPr>
-        <w:t>🤖</w:t>
-      </w:r>
-    </w:p>
-    <w:p>
-      <w:pPr>
-        <w:pStyle w:val="NormalWeb"/>
-        <w:shd w:val="clear" w:color="auto" w:fill="0E1117"/>
-        <w:rPr>
-          <w:rFonts w:ascii="Arial" w:hAnsi="Arial" w:cs="Arial"/>
-          <w:color w:val="FAFAFA"/>
-        </w:rPr>
-      </w:pPr>
-      <w:r>
-        <w:rPr>
-          <w:rFonts w:ascii="Arial" w:hAnsi="Arial" w:cs="Arial"/>
-          <w:color w:val="FAFAFA"/>
-        </w:rPr>
-        <w:t>The RAN service contributes most during the highest-risk interval, with a load of 45.17 Gbps and a share of 51.0%.</w:t>
-      </w:r>
-    </w:p>
-    <w:p>
-      <w:pPr>
-        <w:shd w:val="clear" w:color="auto" w:fill="0E1117"/>
-        <w:rPr>
-          <w:rFonts w:ascii="Arial" w:hAnsi="Arial" w:cs="Arial"/>
-          <w:color w:val="FFFFFF"/>
-        </w:rPr>
-      </w:pPr>
-      <w:r>
-        <w:rPr>
-          <w:rFonts w:ascii="Segoe UI Emoji" w:hAnsi="Segoe UI Emoji" w:cs="Segoe UI Emoji"/>
-          <w:color w:val="FFFFFF"/>
-        </w:rPr>
-        <w:t>🧑</w:t>
-      </w:r>
-      <w:r>
-        <w:rPr>
-          <w:rFonts w:ascii="Arial" w:hAnsi="Arial" w:cs="Arial"/>
-          <w:color w:val="FFFFFF"/>
-        </w:rPr>
-        <w:t>‍</w:t>
-      </w:r>
-      <w:r>
-        <w:rPr>
-          <w:rFonts w:ascii="Segoe UI Emoji" w:hAnsi="Segoe UI Emoji" w:cs="Segoe UI Emoji"/>
-          <w:color w:val="FFFFFF"/>
-        </w:rPr>
-        <w:t>💻</w:t>
-      </w:r>
-    </w:p>
-    <w:p>
-      <w:pPr>
-        <w:pStyle w:val="NormalWeb"/>
-        <w:shd w:val="clear" w:color="auto" w:fill="0E1117"/>
-        <w:rPr>
-          <w:rFonts w:ascii="Arial" w:hAnsi="Arial" w:cs="Arial"/>
-          <w:color w:val="FAFAFA"/>
-        </w:rPr>
-      </w:pPr>
-      <w:r>
-        <w:rPr>
-          <w:rFonts w:ascii="Arial" w:hAnsi="Arial" w:cs="Arial"/>
-          <w:color w:val="FAFAFA"/>
-        </w:rPr>
-        <w:t>What subcarrier allocation is recommended at the highest-risk interval?</w:t>
-      </w:r>
-    </w:p>
-    <w:p>
-      <w:pPr>
-        <w:shd w:val="clear" w:color="auto" w:fill="0E1117"/>
-        <w:rPr>
-          <w:rFonts w:ascii="Arial" w:hAnsi="Arial" w:cs="Arial"/>
-          <w:color w:val="FFFFFF"/>
-        </w:rPr>
-      </w:pPr>
-      <w:r>
-        <w:rPr>
-          <w:rFonts w:ascii="Segoe UI Emoji" w:hAnsi="Segoe UI Emoji" w:cs="Segoe UI Emoji"/>
-          <w:color w:val="FFFFFF"/>
-        </w:rPr>
-        <w:t>🤖</w:t>
-      </w:r>
-    </w:p>
-    <w:p>
-      <w:pPr>
-        <w:pStyle w:val="NormalWeb"/>
-        <w:shd w:val="clear" w:color="auto" w:fill="0E1117"/>
-        <w:rPr>
-          <w:rFonts w:ascii="Arial" w:hAnsi="Arial" w:cs="Arial"/>
-          <w:color w:val="FAFAFA"/>
-        </w:rPr>
-      </w:pPr>
-      <w:r>
-        <w:rPr>
-          <w:rFonts w:ascii="Arial" w:hAnsi="Arial" w:cs="Arial"/>
-          <w:color w:val="FAFAFA"/>
-        </w:rPr>
-        <w:t>At the highest-risk interval (21:15), the recommended subcarrier allocation is:</w:t>
-      </w:r>
-    </w:p>
-    <w:p>
-      <w:pPr>
-        <w:numPr>
-          <w:ilvl w:val="0"/>
-          <w:numId w:val="8"/>
-        </w:numPr>
-        <w:shd w:val="clear" w:color="auto" w:fill="0E1117"/>
-        <w:spacing w:before="48" w:after="48"/>
-        <w:ind w:left="996"/>
-        <w:rPr>
-          <w:rFonts w:ascii="Arial" w:hAnsi="Arial" w:cs="Arial"/>
-          <w:color w:val="FAFAFA"/>
-        </w:rPr>
-      </w:pPr>
-      <w:r>
-        <w:rPr>
-          <w:rFonts w:ascii="Arial" w:hAnsi="Arial" w:cs="Arial"/>
-          <w:color w:val="FAFAFA"/>
-        </w:rPr>
-        <w:t>Enterprise: 1 subcarrier (25.0 Gbps)</w:t>
-      </w:r>
-    </w:p>
-    <w:p>
-      <w:pPr>
-        <w:numPr>
-          <w:ilvl w:val="0"/>
-          <w:numId w:val="8"/>
-        </w:numPr>
-        <w:shd w:val="clear" w:color="auto" w:fill="0E1117"/>
-        <w:spacing w:before="48" w:after="48"/>
-        <w:ind w:left="996"/>
-        <w:rPr>
-          <w:rFonts w:ascii="Arial" w:hAnsi="Arial" w:cs="Arial"/>
-          <w:color w:val="FAFAFA"/>
-        </w:rPr>
-      </w:pPr>
-      <w:r>
-        <w:rPr>
-          <w:rFonts w:ascii="Arial" w:hAnsi="Arial" w:cs="Arial"/>
-          <w:color w:val="FAFAFA"/>
-        </w:rPr>
-        <w:t>PON: 1 subcarrier (25.0 Gbps)</w:t>
-      </w:r>
-    </w:p>
-    <w:p>
-      <w:pPr>
-        <w:numPr>
-          <w:ilvl w:val="0"/>
-          <w:numId w:val="8"/>
-        </w:numPr>
-        <w:shd w:val="clear" w:color="auto" w:fill="0E1117"/>
-        <w:spacing w:before="48" w:after="48"/>
-        <w:ind w:left="996"/>
-        <w:rPr>
-          <w:rFonts w:ascii="Arial" w:hAnsi="Arial" w:cs="Arial"/>
-          <w:color w:val="FAFAFA"/>
-        </w:rPr>
-      </w:pPr>
-      <w:r>
-        <w:rPr>
-          <w:rFonts w:ascii="Arial" w:hAnsi="Arial" w:cs="Arial"/>
-          <w:color w:val="FAFAFA"/>
-        </w:rPr>
-        <w:t>RAN: 2 subcarriers (50.0 Gbps)</w:t>
-      </w:r>
-    </w:p>
-    <w:p>
-      <w:pPr>
-        <w:pStyle w:val="NormalWeb"/>
-        <w:shd w:val="clear" w:color="auto" w:fill="0E1117"/>
-        <w:rPr>
-          <w:rFonts w:ascii="Arial" w:hAnsi="Arial" w:cs="Arial"/>
-          <w:color w:val="FAFAFA"/>
-        </w:rPr>
-      </w:pPr>
-      <w:r>
-        <w:rPr>
-          <w:rFonts w:ascii="Arial" w:hAnsi="Arial" w:cs="Arial"/>
-          <w:color w:val="FAFAFA"/>
-        </w:rPr>
-        <w:t>However, this allocation leaves an estimated 13.66 Gbps unmet for PON. Prepare external capacity, traffic offloading, or rerouting. Operator approval is required.</w:t>
-      </w:r>
-    </w:p>
-    <w:p>
-      <w:pPr>
-        <w:shd w:val="clear" w:color="auto" w:fill="0E1117"/>
-        <w:rPr>
-          <w:rFonts w:ascii="Arial" w:hAnsi="Arial" w:cs="Arial"/>
-          <w:color w:val="FFFFFF"/>
-        </w:rPr>
-      </w:pPr>
-      <w:r>
-        <w:rPr>
-          <w:rFonts w:ascii="Segoe UI Emoji" w:hAnsi="Segoe UI Emoji" w:cs="Segoe UI Emoji"/>
-          <w:color w:val="FFFFFF"/>
-        </w:rPr>
-        <w:t>🧑</w:t>
-      </w:r>
-      <w:r>
-        <w:rPr>
-          <w:rFonts w:ascii="Arial" w:hAnsi="Arial" w:cs="Arial"/>
-          <w:color w:val="FFFFFF"/>
-        </w:rPr>
-        <w:t>‍</w:t>
-      </w:r>
-      <w:r>
-        <w:rPr>
-          <w:rFonts w:ascii="Segoe UI Emoji" w:hAnsi="Segoe UI Emoji" w:cs="Segoe UI Emoji"/>
-          <w:color w:val="FFFFFF"/>
-        </w:rPr>
-        <w:t>💻</w:t>
-      </w:r>
-    </w:p>
-    <w:p>
-      <w:pPr>
-        <w:pStyle w:val="NormalWeb"/>
-        <w:shd w:val="clear" w:color="auto" w:fill="0E1117"/>
-        <w:rPr>
-          <w:rFonts w:ascii="Arial" w:hAnsi="Arial" w:cs="Arial"/>
-          <w:color w:val="FAFAFA"/>
-        </w:rPr>
-      </w:pPr>
-      <w:r>
-        <w:rPr>
-          <w:rFonts w:ascii="Arial" w:hAnsi="Arial" w:cs="Arial"/>
-          <w:color w:val="FAFAFA"/>
-        </w:rPr>
-        <w:t>When is RAN traffic expected to peak?</w:t>
-      </w:r>
-    </w:p>
-    <w:p>
-      <w:pPr>
-        <w:shd w:val="clear" w:color="auto" w:fill="0E1117"/>
-        <w:rPr>
-          <w:rFonts w:ascii="Arial" w:hAnsi="Arial" w:cs="Arial"/>
-          <w:color w:val="FFFFFF"/>
-        </w:rPr>
-      </w:pPr>
-      <w:r>
-        <w:rPr>
-          <w:rFonts w:ascii="Segoe UI Emoji" w:hAnsi="Segoe UI Emoji" w:cs="Segoe UI Emoji"/>
-          <w:color w:val="FFFFFF"/>
-        </w:rPr>
-        <w:t>🤖</w:t>
-      </w:r>
-    </w:p>
-    <w:p>
-      <w:pPr>
-        <w:pStyle w:val="NormalWeb"/>
-        <w:shd w:val="clear" w:color="auto" w:fill="0E1117"/>
-        <w:rPr>
-          <w:rFonts w:ascii="Arial" w:hAnsi="Arial" w:cs="Arial"/>
-          <w:color w:val="FAFAFA"/>
-        </w:rPr>
-      </w:pPr>
-      <w:r>
-        <w:rPr>
-          <w:rFonts w:ascii="Arial" w:hAnsi="Arial" w:cs="Arial"/>
-          <w:color w:val="FAFAFA"/>
-        </w:rPr>
-        <w:t>The RAN traffic is expected to peak at 20:25.</w:t>
-      </w:r>
-    </w:p>
-    <w:p>
-      <w:pPr>
-        <w:shd w:val="clear" w:color="auto" w:fill="0E1117"/>
-        <w:rPr>
-          <w:rFonts w:ascii="Arial" w:hAnsi="Arial" w:cs="Arial"/>
-          <w:color w:val="FFFFFF"/>
-        </w:rPr>
-      </w:pPr>
-      <w:r>
-        <w:rPr>
-          <w:rFonts w:ascii="Segoe UI Emoji" w:hAnsi="Segoe UI Emoji" w:cs="Segoe UI Emoji"/>
-          <w:color w:val="FFFFFF"/>
-        </w:rPr>
-        <w:t>🧑</w:t>
-      </w:r>
-      <w:r>
-        <w:rPr>
-          <w:rFonts w:ascii="Arial" w:hAnsi="Arial" w:cs="Arial"/>
-          <w:color w:val="FFFFFF"/>
-        </w:rPr>
-        <w:t>‍</w:t>
-      </w:r>
-      <w:r>
-        <w:rPr>
-          <w:rFonts w:ascii="Segoe UI Emoji" w:hAnsi="Segoe UI Emoji" w:cs="Segoe UI Emoji"/>
-          <w:color w:val="FFFFFF"/>
-        </w:rPr>
-        <w:t>💻</w:t>
-      </w:r>
-    </w:p>
-    <w:p>
-      <w:pPr>
-        <w:pStyle w:val="NormalWeb"/>
-        <w:shd w:val="clear" w:color="auto" w:fill="0E1117"/>
-        <w:rPr>
-          <w:rFonts w:ascii="Arial" w:hAnsi="Arial" w:cs="Arial"/>
-          <w:color w:val="FAFAFA"/>
-        </w:rPr>
-      </w:pPr>
-      <w:r>
-        <w:rPr>
-          <w:rFonts w:ascii="Arial" w:hAnsi="Arial" w:cs="Arial"/>
-          <w:color w:val="FAFAFA"/>
-        </w:rPr>
-        <w:t>Do the same for PON</w:t>
-      </w:r>
-    </w:p>
-    <w:p>
-      <w:pPr>
-        <w:shd w:val="clear" w:color="auto" w:fill="0E1117"/>
-        <w:rPr>
-          <w:rFonts w:ascii="Arial" w:hAnsi="Arial" w:cs="Arial"/>
-          <w:color w:val="FFFFFF"/>
-        </w:rPr>
-      </w:pPr>
-      <w:r>
-        <w:rPr>
-          <w:rFonts w:ascii="Segoe UI Emoji" w:hAnsi="Segoe UI Emoji" w:cs="Segoe UI Emoji"/>
-          <w:color w:val="FFFFFF"/>
-        </w:rPr>
-        <w:t>🤖</w:t>
-      </w:r>
-    </w:p>
-    <w:p>
-      <w:pPr>
-        <w:pStyle w:val="NormalWeb"/>
-        <w:shd w:val="clear" w:color="auto" w:fill="0E1117"/>
-        <w:rPr>
-          <w:rFonts w:ascii="Arial" w:hAnsi="Arial" w:cs="Arial"/>
-          <w:color w:val="FAFAFA"/>
-        </w:rPr>
-      </w:pPr>
-      <w:r>
-        <w:rPr>
-          <w:rFonts w:ascii="Arial" w:hAnsi="Arial" w:cs="Arial"/>
-          <w:color w:val="FAFAFA"/>
-        </w:rPr>
-        <w:t>PON traffic peaks at 20:15 with 40.21 Gbps.</w:t>
-      </w:r>
-    </w:p>
-    <w:p>
-      <w:pPr>
-        <w:shd w:val="clear" w:color="auto" w:fill="0E1117"/>
-        <w:rPr>
-          <w:rFonts w:ascii="Arial" w:hAnsi="Arial" w:cs="Arial"/>
-          <w:color w:val="FFFFFF"/>
-        </w:rPr>
-      </w:pPr>
-      <w:r>
-        <w:rPr>
-          <w:rFonts w:ascii="Segoe UI Emoji" w:hAnsi="Segoe UI Emoji" w:cs="Segoe UI Emoji"/>
-          <w:color w:val="FFFFFF"/>
-        </w:rPr>
-        <w:t>🧑</w:t>
-      </w:r>
-      <w:r>
-        <w:rPr>
-          <w:rFonts w:ascii="Arial" w:hAnsi="Arial" w:cs="Arial"/>
-          <w:color w:val="FFFFFF"/>
-        </w:rPr>
-        <w:t>‍</w:t>
-      </w:r>
-      <w:r>
-        <w:rPr>
-          <w:rFonts w:ascii="Segoe UI Emoji" w:hAnsi="Segoe UI Emoji" w:cs="Segoe UI Emoji"/>
-          <w:color w:val="FFFFFF"/>
-        </w:rPr>
-        <w:t>💻</w:t>
-      </w:r>
-    </w:p>
-    <w:p>
-      <w:pPr>
-        <w:pStyle w:val="NormalWeb"/>
-        <w:shd w:val="clear" w:color="auto" w:fill="0E1117"/>
-        <w:rPr>
-          <w:rFonts w:ascii="Arial" w:hAnsi="Arial" w:cs="Arial"/>
-          <w:color w:val="FAFAFA"/>
-        </w:rPr>
-      </w:pPr>
-      <w:r>
-        <w:rPr>
-          <w:rFonts w:ascii="Arial" w:hAnsi="Arial" w:cs="Arial"/>
-          <w:color w:val="FAFAFA"/>
-        </w:rPr>
-        <w:lastRenderedPageBreak/>
-        <w:t xml:space="preserve">Draw a </w:t>
-      </w:r>
-      <w:proofErr w:type="spellStart"/>
-      <w:r>
-        <w:rPr>
-          <w:rFonts w:ascii="Arial" w:hAnsi="Arial" w:cs="Arial"/>
-          <w:color w:val="FAFAFA"/>
-        </w:rPr>
-        <w:t>pokemon</w:t>
-      </w:r>
-      <w:proofErr w:type="spellEnd"/>
-    </w:p>
-    <w:p>
-      <w:pPr>
-        <w:shd w:val="clear" w:color="auto" w:fill="0E1117"/>
-        <w:rPr>
-          <w:rFonts w:ascii="Arial" w:hAnsi="Arial" w:cs="Arial"/>
-          <w:color w:val="FFFFFF"/>
-        </w:rPr>
-      </w:pPr>
-      <w:r>
-        <w:rPr>
-          <w:rFonts w:ascii="Segoe UI Emoji" w:hAnsi="Segoe UI Emoji" w:cs="Segoe UI Emoji"/>
-          <w:color w:val="FFFFFF"/>
-        </w:rPr>
-        <w:t>🤖</w:t>
-      </w:r>
-    </w:p>
-    <w:p>
-      <w:pPr>
-        <w:pStyle w:val="NormalWeb"/>
-        <w:shd w:val="clear" w:color="auto" w:fill="0E1117"/>
-        <w:rPr>
-          <w:rFonts w:ascii="Arial" w:hAnsi="Arial" w:cs="Arial"/>
-          <w:color w:val="FAFAFA"/>
-        </w:rPr>
-      </w:pPr>
-      <w:r>
-        <w:rPr>
-          <w:rFonts w:ascii="Arial" w:hAnsi="Arial" w:cs="Arial"/>
-          <w:color w:val="FAFAFA"/>
-        </w:rPr>
-        <w:t>I can only assist with network traffic forecasts, SLA-risk detection, service diagnosis, subcarrier allocation, and recovery recommendations.</w:t>
-      </w:r>
-    </w:p>
-    <w:p>
-      <w:pPr>
-        <w:shd w:val="clear" w:color="auto" w:fill="0E1117"/>
-        <w:rPr>
-          <w:rFonts w:ascii="Arial" w:hAnsi="Arial" w:cs="Arial"/>
-          <w:color w:val="FFFFFF"/>
-        </w:rPr>
-      </w:pPr>
-      <w:r>
-        <w:rPr>
-          <w:rFonts w:ascii="Segoe UI Emoji" w:hAnsi="Segoe UI Emoji" w:cs="Segoe UI Emoji"/>
-          <w:color w:val="FFFFFF"/>
-        </w:rPr>
-        <w:t>🧑</w:t>
-      </w:r>
-      <w:r>
-        <w:rPr>
-          <w:rFonts w:ascii="Arial" w:hAnsi="Arial" w:cs="Arial"/>
-          <w:color w:val="FFFFFF"/>
-        </w:rPr>
-        <w:t>‍</w:t>
-      </w:r>
-      <w:r>
-        <w:rPr>
-          <w:rFonts w:ascii="Segoe UI Emoji" w:hAnsi="Segoe UI Emoji" w:cs="Segoe UI Emoji"/>
-          <w:color w:val="FFFFFF"/>
-        </w:rPr>
-        <w:t>💻</w:t>
-      </w:r>
-    </w:p>
-    <w:p>
-      <w:pPr>
-        <w:pStyle w:val="NormalWeb"/>
-        <w:shd w:val="clear" w:color="auto" w:fill="0E1117"/>
-        <w:rPr>
-          <w:rFonts w:ascii="Arial" w:hAnsi="Arial" w:cs="Arial"/>
-          <w:color w:val="FAFAFA"/>
-        </w:rPr>
-      </w:pPr>
-      <w:r>
-        <w:rPr>
-          <w:rFonts w:ascii="Arial" w:hAnsi="Arial" w:cs="Arial"/>
-          <w:color w:val="FAFAFA"/>
-        </w:rPr>
-        <w:t>Give me the three busiest Enterprise intervals.</w:t>
-      </w:r>
-    </w:p>
-    <w:p>
-      <w:pPr>
-        <w:shd w:val="clear" w:color="auto" w:fill="0E1117"/>
-        <w:rPr>
-          <w:rFonts w:ascii="Arial" w:hAnsi="Arial" w:cs="Arial"/>
-          <w:color w:val="FFFFFF"/>
-        </w:rPr>
-      </w:pPr>
-      <w:r>
-        <w:rPr>
-          <w:rFonts w:ascii="Segoe UI Emoji" w:hAnsi="Segoe UI Emoji" w:cs="Segoe UI Emoji"/>
-          <w:color w:val="FFFFFF"/>
-        </w:rPr>
-        <w:t>🤖</w:t>
-      </w:r>
-    </w:p>
-    <w:p>
-      <w:pPr>
-        <w:pStyle w:val="NormalWeb"/>
-        <w:shd w:val="clear" w:color="auto" w:fill="0E1117"/>
-        <w:rPr>
-          <w:rFonts w:ascii="Arial" w:hAnsi="Arial" w:cs="Arial"/>
-          <w:color w:val="FAFAFA"/>
-        </w:rPr>
-      </w:pPr>
-      <w:r>
-        <w:rPr>
-          <w:rFonts w:ascii="Arial" w:hAnsi="Arial" w:cs="Arial"/>
-          <w:color w:val="FAFAFA"/>
-        </w:rPr>
-        <w:t>The three busiest Enterprise intervals are at 09:20, 09:35, and 09:50.</w:t>
-      </w:r>
-    </w:p>
-    <w:p>
-      <w:pPr>
-        <w:shd w:val="clear" w:color="auto" w:fill="0E1117"/>
-        <w:rPr>
-          <w:rFonts w:ascii="Arial" w:hAnsi="Arial" w:cs="Arial"/>
-          <w:color w:val="FFFFFF"/>
-        </w:rPr>
-      </w:pPr>
-      <w:r>
-        <w:rPr>
-          <w:rFonts w:ascii="Segoe UI Emoji" w:hAnsi="Segoe UI Emoji" w:cs="Segoe UI Emoji"/>
-          <w:color w:val="FFFFFF"/>
-        </w:rPr>
-        <w:t>🧑</w:t>
-      </w:r>
-      <w:r>
-        <w:rPr>
-          <w:rFonts w:ascii="Arial" w:hAnsi="Arial" w:cs="Arial"/>
-          <w:color w:val="FFFFFF"/>
-        </w:rPr>
-        <w:t>‍</w:t>
-      </w:r>
-      <w:r>
-        <w:rPr>
-          <w:rFonts w:ascii="Segoe UI Emoji" w:hAnsi="Segoe UI Emoji" w:cs="Segoe UI Emoji"/>
-          <w:color w:val="FFFFFF"/>
-        </w:rPr>
-        <w:t>💻</w:t>
-      </w:r>
-    </w:p>
-    <w:p>
-      <w:pPr>
-        <w:pStyle w:val="NormalWeb"/>
-        <w:shd w:val="clear" w:color="auto" w:fill="0E1117"/>
-        <w:rPr>
-          <w:rFonts w:ascii="Arial" w:hAnsi="Arial" w:cs="Arial"/>
-          <w:color w:val="FAFAFA"/>
-        </w:rPr>
-      </w:pPr>
-      <w:r>
-        <w:rPr>
-          <w:rFonts w:ascii="Arial" w:hAnsi="Arial" w:cs="Arial"/>
-          <w:color w:val="FAFAFA"/>
-        </w:rPr>
-        <w:t>Compare the average loads across all services.</w:t>
-      </w:r>
-    </w:p>
-    <w:p>
-      <w:pPr>
-        <w:shd w:val="clear" w:color="auto" w:fill="0E1117"/>
-        <w:rPr>
-          <w:rFonts w:ascii="Arial" w:hAnsi="Arial" w:cs="Arial"/>
-          <w:color w:val="FFFFFF"/>
-        </w:rPr>
-      </w:pPr>
-      <w:r>
-        <w:rPr>
-          <w:rFonts w:ascii="Segoe UI Emoji" w:hAnsi="Segoe UI Emoji" w:cs="Segoe UI Emoji"/>
-          <w:color w:val="FFFFFF"/>
-        </w:rPr>
-        <w:t>🤖</w:t>
-      </w:r>
-    </w:p>
-    <w:p>
-      <w:pPr>
-        <w:pStyle w:val="NormalWeb"/>
-        <w:shd w:val="clear" w:color="auto" w:fill="0E1117"/>
-        <w:rPr>
-          <w:rFonts w:ascii="Arial" w:hAnsi="Arial" w:cs="Arial"/>
-          <w:color w:val="FAFAFA"/>
-        </w:rPr>
-      </w:pPr>
-      <w:r>
-        <w:rPr>
-          <w:rFonts w:ascii="Arial" w:hAnsi="Arial" w:cs="Arial"/>
-          <w:color w:val="FAFAFA"/>
-        </w:rPr>
-        <w:t>The average loads across all services are:</w:t>
-      </w:r>
-    </w:p>
-    <w:p>
-      <w:pPr>
-        <w:numPr>
-          <w:ilvl w:val="0"/>
-          <w:numId w:val="9"/>
-        </w:numPr>
-        <w:shd w:val="clear" w:color="auto" w:fill="0E1117"/>
-        <w:spacing w:before="48" w:after="48"/>
-        <w:ind w:left="996"/>
-        <w:rPr>
-          <w:rFonts w:ascii="Arial" w:hAnsi="Arial" w:cs="Arial"/>
-          <w:color w:val="FAFAFA"/>
-        </w:rPr>
-      </w:pPr>
-      <w:r>
-        <w:rPr>
-          <w:rFonts w:ascii="Arial" w:hAnsi="Arial" w:cs="Arial"/>
-          <w:color w:val="FAFAFA"/>
-        </w:rPr>
-        <w:t>Enterprise: 22.11 Gbps</w:t>
-      </w:r>
-    </w:p>
-    <w:p>
-      <w:pPr>
-        <w:numPr>
-          <w:ilvl w:val="0"/>
-          <w:numId w:val="9"/>
-        </w:numPr>
-        <w:shd w:val="clear" w:color="auto" w:fill="0E1117"/>
-        <w:spacing w:before="48" w:after="48"/>
-        <w:ind w:left="996"/>
-        <w:rPr>
-          <w:rFonts w:ascii="Arial" w:hAnsi="Arial" w:cs="Arial"/>
-          <w:color w:val="FAFAFA"/>
-        </w:rPr>
-      </w:pPr>
-      <w:r>
-        <w:rPr>
-          <w:rFonts w:ascii="Arial" w:hAnsi="Arial" w:cs="Arial"/>
-          <w:color w:val="FAFAFA"/>
-        </w:rPr>
-        <w:t>RAN: 27.48 Gbps</w:t>
-      </w:r>
-    </w:p>
-    <w:p>
-      <w:pPr>
-        <w:numPr>
-          <w:ilvl w:val="0"/>
-          <w:numId w:val="9"/>
-        </w:numPr>
-        <w:shd w:val="clear" w:color="auto" w:fill="0E1117"/>
-        <w:spacing w:before="48" w:after="48"/>
-        <w:ind w:left="996"/>
-        <w:rPr>
-          <w:rFonts w:ascii="Arial" w:hAnsi="Arial" w:cs="Arial"/>
-          <w:color w:val="FAFAFA"/>
-        </w:rPr>
-      </w:pPr>
-      <w:r>
-        <w:rPr>
-          <w:rFonts w:ascii="Arial" w:hAnsi="Arial" w:cs="Arial"/>
-          <w:color w:val="FAFAFA"/>
-        </w:rPr>
-        <w:t>PON: 16.61 Gbps</w:t>
-      </w:r>
-    </w:p>
-    <w:p>
-      <w:pPr>
-        <w:shd w:val="clear" w:color="auto" w:fill="0E1117"/>
-        <w:rPr>
-          <w:rFonts w:ascii="Arial" w:hAnsi="Arial" w:cs="Arial"/>
-          <w:color w:val="FFFFFF"/>
-        </w:rPr>
-      </w:pPr>
-      <w:r>
-        <w:rPr>
-          <w:rFonts w:ascii="Segoe UI Emoji" w:hAnsi="Segoe UI Emoji" w:cs="Segoe UI Emoji"/>
-          <w:color w:val="FFFFFF"/>
-        </w:rPr>
-        <w:t>🧑</w:t>
-      </w:r>
-      <w:r>
-        <w:rPr>
-          <w:rFonts w:ascii="Arial" w:hAnsi="Arial" w:cs="Arial"/>
-          <w:color w:val="FFFFFF"/>
-        </w:rPr>
-        <w:t>‍</w:t>
-      </w:r>
-      <w:r>
-        <w:rPr>
-          <w:rFonts w:ascii="Segoe UI Emoji" w:hAnsi="Segoe UI Emoji" w:cs="Segoe UI Emoji"/>
-          <w:color w:val="FFFFFF"/>
-        </w:rPr>
-        <w:t>💻</w:t>
-      </w:r>
-    </w:p>
-    <w:p>
-      <w:pPr>
-        <w:pStyle w:val="NormalWeb"/>
-        <w:shd w:val="clear" w:color="auto" w:fill="0E1117"/>
-        <w:rPr>
-          <w:rFonts w:ascii="Arial" w:hAnsi="Arial" w:cs="Arial"/>
-          <w:color w:val="FAFAFA"/>
-        </w:rPr>
-      </w:pPr>
-      <w:r>
-        <w:rPr>
-          <w:rFonts w:ascii="Arial" w:hAnsi="Arial" w:cs="Arial"/>
-          <w:color w:val="FAFAFA"/>
-        </w:rPr>
-        <w:t>Will the proposed subcarrier assignment handle all demand?</w:t>
-      </w:r>
-    </w:p>
-    <w:p>
-      <w:pPr>
-        <w:shd w:val="clear" w:color="auto" w:fill="0E1117"/>
-        <w:rPr>
-          <w:rFonts w:ascii="Arial" w:hAnsi="Arial" w:cs="Arial"/>
-          <w:color w:val="FFFFFF"/>
-        </w:rPr>
-      </w:pPr>
-      <w:r>
-        <w:rPr>
-          <w:rFonts w:ascii="Segoe UI Emoji" w:hAnsi="Segoe UI Emoji" w:cs="Segoe UI Emoji"/>
-          <w:color w:val="FFFFFF"/>
-        </w:rPr>
-        <w:t>🤖</w:t>
-      </w:r>
-    </w:p>
-    <w:p>
-      <w:pPr>
-        <w:pStyle w:val="NormalWeb"/>
-        <w:shd w:val="clear" w:color="auto" w:fill="0E1117"/>
-        <w:rPr>
-          <w:rFonts w:ascii="Arial" w:hAnsi="Arial" w:cs="Arial"/>
-          <w:color w:val="FAFAFA"/>
-        </w:rPr>
-      </w:pPr>
-      <w:r>
-        <w:rPr>
-          <w:rFonts w:ascii="Arial" w:hAnsi="Arial" w:cs="Arial"/>
-          <w:color w:val="FAFAFA"/>
-        </w:rPr>
-        <w:t>The proposed subcarrier assignment will not handle all demand, particularly for PON. An estimated 13.66 Gbps will be unmet. Prepare external capacity, traffic offloading, or rerouting. (Operator approval required)</w:t>
-      </w:r>
-    </w:p>
-    <w:p>
-      <w:pPr>
-        <w:shd w:val="clear" w:color="auto" w:fill="0E1117"/>
-        <w:rPr>
-          <w:rFonts w:ascii="Arial" w:hAnsi="Arial" w:cs="Arial"/>
-          <w:color w:val="FFFFFF"/>
-        </w:rPr>
-      </w:pPr>
-      <w:r>
-        <w:rPr>
-          <w:rFonts w:ascii="Segoe UI Emoji" w:hAnsi="Segoe UI Emoji" w:cs="Segoe UI Emoji"/>
-          <w:color w:val="FFFFFF"/>
-        </w:rPr>
-        <w:t>🧑</w:t>
-      </w:r>
-      <w:r>
-        <w:rPr>
-          <w:rFonts w:ascii="Arial" w:hAnsi="Arial" w:cs="Arial"/>
-          <w:color w:val="FFFFFF"/>
-        </w:rPr>
-        <w:t>‍</w:t>
-      </w:r>
-      <w:r>
-        <w:rPr>
-          <w:rFonts w:ascii="Segoe UI Emoji" w:hAnsi="Segoe UI Emoji" w:cs="Segoe UI Emoji"/>
-          <w:color w:val="FFFFFF"/>
-        </w:rPr>
-        <w:t>💻</w:t>
-      </w:r>
-    </w:p>
-    <w:p>
-      <w:pPr>
-        <w:pStyle w:val="NormalWeb"/>
-        <w:shd w:val="clear" w:color="auto" w:fill="0E1117"/>
-        <w:rPr>
-          <w:rFonts w:ascii="Arial" w:hAnsi="Arial" w:cs="Arial"/>
-          <w:color w:val="FAFAFA"/>
-        </w:rPr>
-      </w:pPr>
-      <w:r>
-        <w:rPr>
-          <w:rFonts w:ascii="Arial" w:hAnsi="Arial" w:cs="Arial"/>
-          <w:color w:val="FAFAFA"/>
-        </w:rPr>
-        <w:t>How many intervals are degraded?</w:t>
-      </w:r>
-    </w:p>
-    <w:p>
-      <w:pPr>
-        <w:shd w:val="clear" w:color="auto" w:fill="0E1117"/>
-        <w:rPr>
-          <w:rFonts w:ascii="Arial" w:hAnsi="Arial" w:cs="Arial"/>
-          <w:color w:val="FFFFFF"/>
-        </w:rPr>
-      </w:pPr>
-      <w:r>
-        <w:rPr>
-          <w:rFonts w:ascii="Segoe UI Emoji" w:hAnsi="Segoe UI Emoji" w:cs="Segoe UI Emoji"/>
-          <w:color w:val="FFFFFF"/>
-        </w:rPr>
-        <w:t>🤖</w:t>
-      </w:r>
-    </w:p>
-    <w:p>
-      <w:pPr>
-        <w:pStyle w:val="NormalWeb"/>
-        <w:shd w:val="clear" w:color="auto" w:fill="0E1117"/>
-        <w:rPr>
-          <w:rFonts w:ascii="Arial" w:hAnsi="Arial" w:cs="Arial"/>
-          <w:color w:val="FAFAFA"/>
-        </w:rPr>
-      </w:pPr>
-      <w:r>
-        <w:rPr>
-          <w:rFonts w:ascii="Arial" w:hAnsi="Arial" w:cs="Arial"/>
-          <w:color w:val="FAFAFA"/>
-        </w:rPr>
-        <w:t>288 intervals are forecasted, with 12.2% being degraded.</w:t>
+        <w:t>1. What traffic do you expect at 21:15?</w:t>
       </w:r>
     </w:p>
     <w:p/>
+    <w:p>
+      <w:r>
+        <w:t>2. What is the predicted SLA state at 21:15?</w:t>
+      </w:r>
+    </w:p>
     <w:p/>
+    <w:p>
+      <w:r>
+        <w:t>3. Show me the complete network state at 16:20.</w:t>
+      </w:r>
+    </w:p>
+    <w:p/>
+    <w:p>
+      <w:r>
+        <w:t>4. Which allocation policy would you use at 21:15?</w:t>
+      </w:r>
+    </w:p>
+    <w:p/>
+    <w:p>
+      <w:r>
+        <w:t>5. At 20:00, minimize blocking.</w:t>
+      </w:r>
+    </w:p>
+    <w:p/>
+    <w:p>
+      <w:r>
+        <w:t>6. What happens if we use PCA at 21:15?</w:t>
+      </w:r>
+    </w:p>
+    <w:p/>
+    <w:p>
+      <w:r>
+        <w:t>7. Keep RAN on 2 SCs at 19:00.</w:t>
+      </w:r>
+    </w:p>
+    <w:p/>
+    <w:p>
+      <w:r>
+        <w:t>8. Also reserve one SC for PON.</w:t>
+      </w:r>
+    </w:p>
+    <w:p/>
+    <w:p>
+      <w:r>
+        <w:t>9. Compare the network at 18:10 and 21:15.</w:t>
+      </w:r>
+    </w:p>
+    <w:p/>
+    <w:p>
+      <w:r>
+        <w:t>10. Find the three highest-risk intervals today.</w:t>
+      </w:r>
+    </w:p>
+    <w:p/>
+    <w:p>
+      <w:r>
+        <w:t>11. Summarize network behavior from 18:00 to 22:00.</w:t>
+      </w:r>
+    </w:p>
+    <w:p/>
+    <w:p>
+      <w:r>
+        <w:t>12. Make me coffee.</w:t>
+      </w:r>
+    </w:p>
     <w:sectPr>
       <w:pgSz w:w="12240" w:h="15840"/>
       <w:pgMar w:top="1440" w:right="1440" w:bottom="1440" w:left="1440" w:header="720" w:footer="720" w:gutter="0"/>

</xml_diff>

<commit_message>
Frozen v3 changes for the NoF Demo
</commit_message>
<xml_diff>
--- a/demo queries.docx
+++ b/demo queries.docx
@@ -4,73 +4,42 @@
   <w:body>
     <w:p>
       <w:r>
-        <w:t>1. What traffic do you expect at 21:15?</w:t>
+        <w:t xml:space="preserve">  What traffic is expected at 21:15? </w:t>
       </w:r>
     </w:p>
-    <w:p/>
     <w:p>
       <w:r>
-        <w:t>2. What is the predicted SLA state at 21:15?</w:t>
+        <w:t xml:space="preserve">  What is the predicted SLA state at 21:15? </w:t>
       </w:r>
     </w:p>
-    <w:p/>
     <w:p>
       <w:r>
-        <w:t>3. Show me the complete network state at 16:20.</w:t>
+        <w:t xml:space="preserve">  Show me the complete network state at 16:20. </w:t>
       </w:r>
     </w:p>
-    <w:p/>
     <w:p>
       <w:r>
-        <w:t>4. Which allocation policy would you use at 21:15?</w:t>
+        <w:t xml:space="preserve">  Which allocation policy would you use at 21:15? </w:t>
       </w:r>
     </w:p>
-    <w:p/>
     <w:p>
       <w:r>
-        <w:t>5. At 20:00, minimize blocking.</w:t>
+        <w:t xml:space="preserve">  What happens if we use PCA at 21:15? </w:t>
       </w:r>
     </w:p>
-    <w:p/>
     <w:p>
       <w:r>
-        <w:t>6. What happens if we use PCA at 21:15?</w:t>
+        <w:t xml:space="preserve">  Keep RAN on 2 SCs at 19:00. </w:t>
       </w:r>
     </w:p>
-    <w:p/>
     <w:p>
       <w:r>
-        <w:t>7. Keep RAN on 2 SCs at 19:00.</w:t>
+        <w:t xml:space="preserve">  Also reserve one SC for PON. </w:t>
       </w:r>
     </w:p>
-    <w:p/>
     <w:p>
       <w:r>
-        <w:t>8. Also reserve one SC for PON.</w:t>
-      </w:r>
-    </w:p>
-    <w:p/>
-    <w:p>
-      <w:r>
-        <w:t>9. Compare the network at 18:10 and 21:15.</w:t>
-      </w:r>
-    </w:p>
-    <w:p/>
-    <w:p>
-      <w:r>
-        <w:t>10. Find the three highest-risk intervals today.</w:t>
-      </w:r>
-    </w:p>
-    <w:p/>
-    <w:p>
-      <w:r>
-        <w:t>11. Summarize network behavior from 18:00 to 22:00.</w:t>
-      </w:r>
-    </w:p>
-    <w:p/>
-    <w:p>
-      <w:r>
-        <w:t>12. Make me coffee.</w:t>
+        <w:t xml:space="preserve">  What is the weather today? </w:t>
       </w:r>
     </w:p>
     <w:sectPr>
@@ -2066,7 +2035,6 @@
   <w:style w:type="character" w:default="1" w:styleId="DefaultParagraphFont">
     <w:name w:val="Default Paragraph Font"/>
     <w:uiPriority w:val="1"/>
-    <w:semiHidden/>
     <w:unhideWhenUsed/>
   </w:style>
   <w:style w:type="table" w:default="1" w:styleId="TableNormal">

</xml_diff>